<commit_message>
Refonte du CV et de la lettre Genève (Services Financiers)
Profil relié au poste dès l'en-tête, dates en mois partout, cours réduits,
Power Automate dans les missions, projet personnel de recherche on-chain
à la place d'Ethereum France, mise en page plus aérée sur une page.

Co-Authored-By: Claude Fable 5.1 <noreply@anthropic.com>
Claude-Session: https://claude.ai/code/session_01P3Kd8XYUicGcrJRpAjXmWU
</commit_message>
<xml_diff>
--- a/candidature-ey-lausanne/CV_Ahmed-Razine_Khontachi_EY_Geneve.docx
+++ b/candidature-ey-lausanne/CV_Ahmed-Razine_Khontachi_EY_Geneve.docx
@@ -4,7 +4,7 @@
   <w:body>
     <w:tbl>
       <w:tblPr>
-        <w:tblW w:type="dxa" w:w="10580"/>
+        <w:tblW w:type="dxa" w:w="10620"/>
         <w:tblBorders>
           <w:top w:val="none" w:color="FFFFFF" w:sz="0"/>
           <w:left w:val="none" w:color="FFFFFF" w:sz="0"/>
@@ -15,13 +15,13 @@
         </w:tblBorders>
       </w:tblPr>
       <w:tblGrid>
-        <w:gridCol w:w="8580"/>
+        <w:gridCol w:w="8620"/>
         <w:gridCol w:w="2000"/>
       </w:tblGrid>
       <w:tr>
         <w:tc>
           <w:tcPr>
-            <w:tcW w:type="dxa" w:w="8580"/>
+            <w:tcW w:type="dxa" w:w="8620"/>
             <w:tcBorders>
               <w:top w:val="none" w:color="FFFFFF" w:sz="0"/>
               <w:left w:val="none" w:color="FFFFFF" w:sz="0"/>
@@ -38,7 +38,7 @@
           </w:tcPr>
           <w:p>
             <w:pPr>
-              <w:spacing w:after="20"/>
+              <w:spacing w:after="30"/>
             </w:pPr>
             <w:r>
               <w:rPr>
@@ -46,30 +46,43 @@
                 <w:b/>
                 <w:bCs/>
                 <w:color w:val="1F3864"/>
-                <w:sz w:val="36"/>
-                <w:szCs w:val="36"/>
+                <w:sz w:val="38"/>
+                <w:szCs w:val="38"/>
               </w:rPr>
               <w:t xml:space="preserve">Ahmed-Razine KHONTACHI</w:t>
             </w:r>
           </w:p>
           <w:p>
             <w:pPr>
-              <w:spacing w:after="60"/>
+              <w:spacing w:after="10"/>
             </w:pPr>
             <w:r>
               <w:rPr>
                 <w:rFonts w:ascii="Calibri" w:cs="Calibri" w:eastAsia="Calibri" w:hAnsi="Calibri"/>
                 <w:b/>
                 <w:bCs/>
-                <w:sz w:val="21"/>
-                <w:szCs w:val="21"/>
+                <w:sz w:val="23"/>
+                <w:szCs w:val="23"/>
               </w:rPr>
-              <w:t xml:space="preserve">Apprenti analyste financier, Groupe BPCE  |  Master Audit, Audencia (diplôme juin 2027)</w:t>
+              <w:t xml:space="preserve">Candidat Assistant Audit Services Financiers – octobre 2027</w:t>
             </w:r>
           </w:p>
           <w:p>
             <w:pPr>
-              <w:spacing w:after="20" w:before="0" w:line="240"/>
+              <w:spacing w:after="80"/>
+            </w:pPr>
+            <w:r>
+              <w:rPr>
+                <w:rFonts w:ascii="Calibri" w:cs="Calibri" w:eastAsia="Calibri" w:hAnsi="Calibri"/>
+                <w:sz w:val="21"/>
+                <w:szCs w:val="21"/>
+              </w:rPr>
+              <w:t xml:space="preserve">Apprenti analyste financier au Groupe BPCE  ·  Master Audit, Audencia (diplôme juin 2027)</w:t>
+            </w:r>
+          </w:p>
+          <w:p>
+            <w:pPr>
+              <w:spacing w:after="20" w:before="0" w:line="252"/>
             </w:pPr>
             <w:r>
               <w:rPr>
@@ -92,7 +105,7 @@
           </w:p>
           <w:p>
             <w:pPr>
-              <w:spacing w:after="20" w:before="0" w:line="240"/>
+              <w:spacing w:after="20" w:before="0" w:line="252"/>
             </w:pPr>
             <w:r>
               <w:rPr>
@@ -100,7 +113,7 @@
                 <w:sz w:val="20"/>
                 <w:szCs w:val="20"/>
               </w:rPr>
-              <w:t xml:space="preserve">Nationalité française (ressortissant UE/AELE)  ·  Né le </w:t>
+              <w:t xml:space="preserve">Nationalité française (UE/AELE)  ·  Né le </w:t>
             </w:r>
             <w:r>
               <w:rPr>
@@ -133,7 +146,7 @@
           </w:p>
           <w:p>
             <w:pPr>
-              <w:spacing w:after="0" w:before="0" w:line="240"/>
+              <w:spacing w:after="0" w:before="0" w:line="252"/>
             </w:pPr>
             <w:r>
               <w:rPr>
@@ -141,7 +154,7 @@
                 <w:sz w:val="20"/>
                 <w:szCs w:val="20"/>
               </w:rPr>
-              <w:t xml:space="preserve">Installation en Suisse prévue  ·  Disponible dès octobre 2027  ·  Titulaire du permis de conduire</w:t>
+              <w:t xml:space="preserve">Installation en Suisse prévue pour octobre 2027  ·  Titulaire du permis de conduire</w:t>
             </w:r>
           </w:p>
         </w:tc>
@@ -159,7 +172,7 @@
           </w:tcPr>
           <w:p>
             <w:pPr>
-              <w:spacing w:after="0" w:before="500"/>
+              <w:spacing w:after="0" w:before="520"/>
               <w:jc w:val="center"/>
             </w:pPr>
             <w:r>
@@ -189,7 +202,7 @@
           </w:p>
           <w:p>
             <w:pPr>
-              <w:spacing w:after="500"/>
+              <w:spacing w:after="520"/>
               <w:jc w:val="center"/>
             </w:pPr>
             <w:r>
@@ -211,7 +224,7 @@
         <w:pBdr>
           <w:bottom w:val="single" w:color="1F3864" w:sz="6" w:space="2"/>
         </w:pBdr>
-        <w:spacing w:after="30" w:before="90"/>
+        <w:spacing w:after="50" w:before="110"/>
       </w:pPr>
       <w:r>
         <w:rPr>
@@ -235,7 +248,7 @@
           <w:sz w:val="20"/>
           <w:szCs w:val="20"/>
         </w:rPr>
-        <w:t xml:space="preserve">Futur diplômé (juin 2027) du Master Audit d’Audencia, apprenti à la Direction financière du Groupe BPCE (contrôle de données d’instruments financiers, clôtures, justificatifs pour les commissaires aux comptes), après deux stages en cabinet comptable et d’audit. Membre d’Ethereum France. Objectif : débuter en audit des services financiers chez EY Genève et préparer le diplôme d’expert-comptable suisse.</w:t>
+        <w:t xml:space="preserve">Au quotidien, je contrôle les données d’instruments financiers d’une direction financière et je prépare ce que les commissaires aux comptes viennent vérifier ; par intérêt, j’analyse les marchés on-chain avec la même exigence de preuve. Votre poste réunit ces deux mondes, l’audit des établissements financiers et les actifs numériques ; j’y vise un début en octobre 2027 et le diplôme d’expert-comptable suisse.</w:t>
       </w:r>
     </w:p>
     <w:p>
@@ -244,7 +257,7 @@
         <w:pBdr>
           <w:bottom w:val="single" w:color="1F3864" w:sz="6" w:space="2"/>
         </w:pBdr>
-        <w:spacing w:after="30" w:before="90"/>
+        <w:spacing w:after="50" w:before="110"/>
       </w:pPr>
       <w:r>
         <w:rPr>
@@ -262,9 +275,9 @@
       <w:pPr>
         <w:keepNext/>
         <w:tabs>
-          <w:tab w:val="right" w:pos="10580"/>
+          <w:tab w:val="right" w:pos="10620"/>
         </w:tabs>
-        <w:spacing w:after="0" w:before="70" w:line="240"/>
+        <w:spacing w:after="0" w:before="80" w:line="252"/>
       </w:pPr>
       <w:r>
         <w:rPr>
@@ -283,7 +296,7 @@
           <w:sz w:val="20"/>
           <w:szCs w:val="20"/>
         </w:rPr>
-        <w:t xml:space="preserve">, Nantes (France)</w:t>
+        <w:t xml:space="preserve">, Nantes</w:t>
       </w:r>
       <w:r>
         <w:t xml:space="preserve">	</w:t>
@@ -303,7 +316,7 @@
     <w:p>
       <w:pPr>
         <w:keepNext/>
-        <w:spacing w:after="10" w:before="0" w:line="240"/>
+        <w:spacing w:after="30" w:before="0" w:line="252"/>
       </w:pPr>
       <w:r>
         <w:rPr>
@@ -313,7 +326,7 @@
           <w:sz w:val="20"/>
           <w:szCs w:val="20"/>
         </w:rPr>
-        <w:t xml:space="preserve">Programme Grande École, spécialisation Audit – grade de Master (bac+5, diplôme visé par l’État), suivi en apprentissage (alternance école / entreprise)</w:t>
+        <w:t xml:space="preserve">Programme Grande École, spécialisation Audit – grade de Master (bac+5), en apprentissage ; 5 équivalences sur 7 UE du DSCG</w:t>
       </w:r>
     </w:p>
     <w:p>
@@ -323,24 +336,24 @@
           <w:ilvl w:val="0"/>
           <w:numId w:val="2"/>
         </w:numPr>
-        <w:spacing w:after="10" w:before="0" w:line="240"/>
-      </w:pPr>
-      <w:r>
-        <w:rPr>
-          <w:rFonts w:ascii="Calibri" w:cs="Calibri" w:eastAsia="Calibri" w:hAnsi="Calibri"/>
-          <w:sz w:val="20"/>
-          <w:szCs w:val="20"/>
-        </w:rPr>
-        <w:t xml:space="preserve">Cours : audit et contrôle interne, comptabilité approfondie et IFRS, finance d’entreprise et marchés financiers, évaluation d’entreprise, contrôle de gestion, droit et fiscalité, systèmes d’information. Confère 5 équivalences sur 7 UE du DSCG (filière française d’expertise comptable).</w:t>
+        <w:spacing w:after="20" w:before="0" w:line="252"/>
+      </w:pPr>
+      <w:r>
+        <w:rPr>
+          <w:rFonts w:ascii="Calibri" w:cs="Calibri" w:eastAsia="Calibri" w:hAnsi="Calibri"/>
+          <w:sz w:val="20"/>
+          <w:szCs w:val="20"/>
+        </w:rPr>
+        <w:t xml:space="preserve">Cours clés : audit et contrôle interne, comptabilité approfondie et IFRS, finance de marché et instruments financiers, management des systèmes d’information.</w:t>
       </w:r>
     </w:p>
     <w:p>
       <w:pPr>
         <w:keepNext/>
         <w:tabs>
-          <w:tab w:val="right" w:pos="10580"/>
+          <w:tab w:val="right" w:pos="10620"/>
         </w:tabs>
-        <w:spacing w:after="0" w:before="70" w:line="240"/>
+        <w:spacing w:after="0" w:before="80" w:line="252"/>
       </w:pPr>
       <w:r>
         <w:rPr>
@@ -373,13 +386,13 @@
           <w:sz w:val="20"/>
           <w:szCs w:val="20"/>
         </w:rPr>
-        <w:t xml:space="preserve">2024 – 2025</w:t>
-      </w:r>
-    </w:p>
-    <w:p>
-      <w:pPr>
-        <w:keepNext/>
-        <w:spacing w:after="10" w:before="0" w:line="240"/>
+        <w:t xml:space="preserve">sept. 2024 – juin 2025</w:t>
+      </w:r>
+    </w:p>
+    <w:p>
+      <w:pPr>
+        <w:keepNext/>
+        <w:spacing w:after="30" w:before="0" w:line="252"/>
       </w:pPr>
       <w:r>
         <w:rPr>
@@ -389,16 +402,16 @@
           <w:sz w:val="20"/>
           <w:szCs w:val="20"/>
         </w:rPr>
-        <w:t xml:space="preserve">Licence 3 Économie-Gestion (bac+3) en double cursus avec la classe préparatoire ATS (concours des grandes écoles)</w:t>
+        <w:t xml:space="preserve">Licence 3 Économie-Gestion (bac+3) en double cursus avec la classe préparatoire ATS</w:t>
       </w:r>
     </w:p>
     <w:p>
       <w:pPr>
         <w:keepNext/>
         <w:tabs>
-          <w:tab w:val="right" w:pos="10580"/>
+          <w:tab w:val="right" w:pos="10620"/>
         </w:tabs>
-        <w:spacing w:after="0" w:before="70" w:line="240"/>
+        <w:spacing w:after="0" w:before="80" w:line="252"/>
       </w:pPr>
       <w:r>
         <w:rPr>
@@ -431,13 +444,13 @@
           <w:sz w:val="20"/>
           <w:szCs w:val="20"/>
         </w:rPr>
-        <w:t xml:space="preserve">2021 – 2024</w:t>
-      </w:r>
-    </w:p>
-    <w:p>
-      <w:pPr>
-        <w:keepNext/>
-        <w:spacing w:after="10" w:before="0" w:line="240"/>
+        <w:t xml:space="preserve">sept. 2021 – juin 2024</w:t>
+      </w:r>
+    </w:p>
+    <w:p>
+      <w:pPr>
+        <w:keepNext/>
+        <w:spacing w:after="30" w:before="0" w:line="252"/>
       </w:pPr>
       <w:r>
         <w:rPr>
@@ -447,7 +460,7 @@
           <w:sz w:val="20"/>
           <w:szCs w:val="20"/>
         </w:rPr>
-        <w:t xml:space="preserve">DCG, Diplôme de comptabilité et de gestion (bac+3, filière expertise comptable) et BUT GEA option Finance – classé 3e sur 150</w:t>
+        <w:t xml:space="preserve">DCG (Diplôme de comptabilité et de gestion, bac+3) et BUT GEA option Finance – classé 3e sur 150</w:t>
       </w:r>
     </w:p>
     <w:p>
@@ -456,7 +469,7 @@
         <w:pBdr>
           <w:bottom w:val="single" w:color="1F3864" w:sz="6" w:space="2"/>
         </w:pBdr>
-        <w:spacing w:after="30" w:before="90"/>
+        <w:spacing w:after="50" w:before="110"/>
       </w:pPr>
       <w:r>
         <w:rPr>
@@ -474,9 +487,9 @@
       <w:pPr>
         <w:keepNext/>
         <w:tabs>
-          <w:tab w:val="right" w:pos="10580"/>
+          <w:tab w:val="right" w:pos="10620"/>
         </w:tabs>
-        <w:spacing w:after="0" w:before="70" w:line="240"/>
+        <w:spacing w:after="0" w:before="80" w:line="252"/>
       </w:pPr>
       <w:r>
         <w:rPr>
@@ -515,7 +528,7 @@
     <w:p>
       <w:pPr>
         <w:keepNext/>
-        <w:spacing w:after="10" w:before="0" w:line="240"/>
+        <w:spacing w:after="30" w:before="0" w:line="252"/>
       </w:pPr>
       <w:r>
         <w:rPr>
@@ -525,7 +538,7 @@
           <w:sz w:val="20"/>
           <w:szCs w:val="20"/>
         </w:rPr>
-        <w:t xml:space="preserve">Apprenti analyste financier – Référentiel titres, assurance-vie (contrat d’apprentissage en cours)</w:t>
+        <w:t xml:space="preserve">Apprenti analyste financier – Référentiel titres (contrat d’apprentissage en cours)</w:t>
       </w:r>
     </w:p>
     <w:p>
@@ -535,15 +548,15 @@
           <w:ilvl w:val="0"/>
           <w:numId w:val="2"/>
         </w:numPr>
-        <w:spacing w:after="10" w:before="0" w:line="240"/>
-      </w:pPr>
-      <w:r>
-        <w:rPr>
-          <w:rFonts w:ascii="Calibri" w:cs="Calibri" w:eastAsia="Calibri" w:hAnsi="Calibri"/>
-          <w:sz w:val="20"/>
-          <w:szCs w:val="20"/>
-        </w:rPr>
-        <w:t xml:space="preserve">Contrôlé les données de référence de plusieurs milliers d’instruments financiers (ISIN, devise, prix, classification, coupons) dans SimCorp Dimension, par rapprochement avec Bloomberg et les documents contractuels (term sheets, avis d’opéré).</w:t>
+        <w:spacing w:after="20" w:before="0" w:line="252"/>
+      </w:pPr>
+      <w:r>
+        <w:rPr>
+          <w:rFonts w:ascii="Calibri" w:cs="Calibri" w:eastAsia="Calibri" w:hAnsi="Calibri"/>
+          <w:sz w:val="20"/>
+          <w:szCs w:val="20"/>
+        </w:rPr>
+        <w:t xml:space="preserve">Contrôlé les données de plusieurs milliers d’instruments financiers (obligations, EMTN, fonds, dérivés) par rapprochement entre SimCorp Dimension, Bloomberg et les documents contractuels ; créé plusieurs centaines de titres.</w:t>
       </w:r>
     </w:p>
     <w:p>
@@ -553,15 +566,15 @@
           <w:ilvl w:val="0"/>
           <w:numId w:val="2"/>
         </w:numPr>
-        <w:spacing w:after="10" w:before="0" w:line="240"/>
-      </w:pPr>
-      <w:r>
-        <w:rPr>
-          <w:rFonts w:ascii="Calibri" w:cs="Calibri" w:eastAsia="Calibri" w:hAnsi="Calibri"/>
-          <w:sz w:val="20"/>
-          <w:szCs w:val="20"/>
-        </w:rPr>
-        <w:t xml:space="preserve">Créé et paramétré plusieurs centaines de titres (obligations, EMTN, fonds, dérivés) après contrôle de cohérence des sources, justificatifs conservés.</w:t>
+        <w:spacing w:after="20" w:before="0" w:line="252"/>
+      </w:pPr>
+      <w:r>
+        <w:rPr>
+          <w:rFonts w:ascii="Calibri" w:cs="Calibri" w:eastAsia="Calibri" w:hAnsi="Calibri"/>
+          <w:sz w:val="20"/>
+          <w:szCs w:val="20"/>
+        </w:rPr>
+        <w:t xml:space="preserve">Participé aux clôtures mensuelles, trimestrielles et annuelles (prix, taux de référence, données de marché) et préparé les justificatifs demandés par les commissaires aux comptes et le contrôle interne.</w:t>
       </w:r>
     </w:p>
     <w:p>
@@ -571,15 +584,15 @@
           <w:ilvl w:val="0"/>
           <w:numId w:val="2"/>
         </w:numPr>
-        <w:spacing w:after="10" w:before="0" w:line="240"/>
-      </w:pPr>
-      <w:r>
-        <w:rPr>
-          <w:rFonts w:ascii="Calibri" w:cs="Calibri" w:eastAsia="Calibri" w:hAnsi="Calibri"/>
-          <w:sz w:val="20"/>
-          <w:szCs w:val="20"/>
-        </w:rPr>
-        <w:t xml:space="preserve">Participé aux travaux de clôture mensuelle, trimestrielle et annuelle : contrôle des prix et de leur fraîcheur, alimentation des fixings et données de marché, suivi des produits dérivés.</w:t>
+        <w:spacing w:after="20" w:before="0" w:line="252"/>
+      </w:pPr>
+      <w:r>
+        <w:rPr>
+          <w:rFonts w:ascii="Calibri" w:cs="Calibri" w:eastAsia="Calibri" w:hAnsi="Calibri"/>
+          <w:sz w:val="20"/>
+          <w:szCs w:val="20"/>
+        </w:rPr>
+        <w:t xml:space="preserve">Analysé et documenté les écarts (coupon d’EMTN, classifications) : calcul attendu reconstitué, origine identifiée, correction sécurisée avec la MOA ou le fournisseur de données.</w:t>
       </w:r>
     </w:p>
     <w:p>
@@ -589,15 +602,15 @@
           <w:ilvl w:val="0"/>
           <w:numId w:val="2"/>
         </w:numPr>
-        <w:spacing w:after="10" w:before="0" w:line="240"/>
-      </w:pPr>
-      <w:r>
-        <w:rPr>
-          <w:rFonts w:ascii="Calibri" w:cs="Calibri" w:eastAsia="Calibri" w:hAnsi="Calibri"/>
-          <w:sz w:val="20"/>
-          <w:szCs w:val="20"/>
-        </w:rPr>
-        <w:t xml:space="preserve">Analysé et documenté les écarts (coupon d’EMTN, classification Bloomberg vs référentiel) : reconstitution du calcul attendu, identification de l’origine, correction sécurisée avec la MOA ou le fournisseur de données.</w:t>
+        <w:spacing w:after="20" w:before="0" w:line="252"/>
+      </w:pPr>
+      <w:r>
+        <w:rPr>
+          <w:rFonts w:ascii="Calibri" w:cs="Calibri" w:eastAsia="Calibri" w:hAnsi="Calibri"/>
+          <w:sz w:val="20"/>
+          <w:szCs w:val="20"/>
+        </w:rPr>
+        <w:t xml:space="preserve">Contribué aux reportings réglementaires et de suivi (dont reporting Volcker).</w:t>
       </w:r>
     </w:p>
     <w:p>
@@ -607,15 +620,91 @@
           <w:ilvl w:val="0"/>
           <w:numId w:val="2"/>
         </w:numPr>
-        <w:spacing w:after="10" w:before="0" w:line="240"/>
-      </w:pPr>
-      <w:r>
-        <w:rPr>
-          <w:rFonts w:ascii="Calibri" w:cs="Calibri" w:eastAsia="Calibri" w:hAnsi="Calibri"/>
-          <w:sz w:val="20"/>
-          <w:szCs w:val="20"/>
-        </w:rPr>
-        <w:t xml:space="preserve">Contribué aux reportings de suivi et réglementaires (dont reporting Volcker) et préparé les justificatifs demandés par les commissaires aux comptes et le contrôle interne.</w:t>
+        <w:spacing w:after="20" w:before="0" w:line="252"/>
+      </w:pPr>
+      <w:r>
+        <w:rPr>
+          <w:rFonts w:ascii="Calibri" w:cs="Calibri" w:eastAsia="Calibri" w:hAnsi="Calibri"/>
+          <w:sz w:val="20"/>
+          <w:szCs w:val="20"/>
+        </w:rPr>
+        <w:t xml:space="preserve">Automatisé sous Excel/VBA le retraitement de fichiers hétérogènes avec contrôles intégrés (devise, variation de prix, champs obligatoires) et conçu un flux Power Automate </w:t>
+      </w:r>
+      <w:r>
+        <w:rPr>
+          <w:rFonts w:ascii="Calibri" w:cs="Calibri" w:eastAsia="Calibri" w:hAnsi="Calibri"/>
+          <w:sz w:val="20"/>
+          <w:szCs w:val="20"/>
+          <w:highlight w:val="yellow"/>
+          <w:highlightCs w:val="yellow"/>
+        </w:rPr>
+        <w:t xml:space="preserve">[objet du flux et résultat : à préciser]</w:t>
+      </w:r>
+      <w:r>
+        <w:rPr>
+          <w:rFonts w:ascii="Calibri" w:cs="Calibri" w:eastAsia="Calibri" w:hAnsi="Calibri"/>
+          <w:sz w:val="20"/>
+          <w:szCs w:val="20"/>
+        </w:rPr>
+        <w:t xml:space="preserve">.</w:t>
+      </w:r>
+    </w:p>
+    <w:p>
+      <w:pPr>
+        <w:keepNext/>
+        <w:tabs>
+          <w:tab w:val="right" w:pos="10620"/>
+        </w:tabs>
+        <w:spacing w:after="0" w:before="80" w:line="252"/>
+      </w:pPr>
+      <w:r>
+        <w:rPr>
+          <w:rFonts w:ascii="Calibri" w:cs="Calibri" w:eastAsia="Calibri" w:hAnsi="Calibri"/>
+          <w:b/>
+          <w:bCs/>
+          <w:sz w:val="20"/>
+          <w:szCs w:val="20"/>
+        </w:rPr>
+        <w:t xml:space="preserve">Pôle Sud – cabinet d’expertise comptable</w:t>
+      </w:r>
+      <w:r>
+        <w:rPr>
+          <w:rFonts w:ascii="Calibri" w:cs="Calibri" w:eastAsia="Calibri" w:hAnsi="Calibri"/>
+          <w:color w:val="555555"/>
+          <w:sz w:val="20"/>
+          <w:szCs w:val="20"/>
+        </w:rPr>
+        <w:t xml:space="preserve">, Toulouse</w:t>
+      </w:r>
+      <w:r>
+        <w:t xml:space="preserve">	</w:t>
+      </w:r>
+      <w:r>
+        <w:rPr>
+          <w:rFonts w:ascii="Calibri" w:cs="Calibri" w:eastAsia="Calibri" w:hAnsi="Calibri"/>
+          <w:b/>
+          <w:bCs/>
+          <w:color w:val="1F3864"/>
+          <w:sz w:val="20"/>
+          <w:szCs w:val="20"/>
+        </w:rPr>
+        <w:t xml:space="preserve">janv. 2024 – juin 2024</w:t>
+      </w:r>
+    </w:p>
+    <w:p>
+      <w:pPr>
+        <w:keepNext/>
+        <w:spacing w:after="30" w:before="0" w:line="252"/>
+      </w:pPr>
+      <w:r>
+        <w:rPr>
+          <w:rFonts w:ascii="Calibri" w:cs="Calibri" w:eastAsia="Calibri" w:hAnsi="Calibri"/>
+          <w:i/>
+          <w:iCs/>
+          <w:sz w:val="20"/>
+          <w:szCs w:val="20"/>
+        </w:rPr>
+        <w:t xml:space="preserve">Stagiaire comptable et assistant audit</w:t>
       </w:r>
     </w:p>
     <w:p>
@@ -625,15 +714,73 @@
           <w:ilvl w:val="0"/>
           <w:numId w:val="2"/>
         </w:numPr>
-        <w:spacing w:after="10" w:before="0" w:line="240"/>
-      </w:pPr>
-      <w:r>
-        <w:rPr>
-          <w:rFonts w:ascii="Calibri" w:cs="Calibri" w:eastAsia="Calibri" w:hAnsi="Calibri"/>
-          <w:sz w:val="20"/>
-          <w:szCs w:val="20"/>
-        </w:rPr>
-        <w:t xml:space="preserve">Automatisé sous Excel/VBA le retraitement de fichiers hétérogènes avec contrôles intégrés (devise, variation de prix, champs obligatoires) : anomalies détectées avant intégration, manipulations manuelles réduites.</w:t>
+        <w:spacing w:after="20" w:before="0" w:line="252"/>
+      </w:pPr>
+      <w:r>
+        <w:rPr>
+          <w:rFonts w:ascii="Calibri" w:cs="Calibri" w:eastAsia="Calibri" w:hAnsi="Calibri"/>
+          <w:sz w:val="20"/>
+          <w:szCs w:val="20"/>
+        </w:rPr>
+        <w:t xml:space="preserve">Participé à l’établissement des états financiers de PME et aux clôtures ; assisté les travaux d’audit (documentation, vérification des écritures et pièces justificatives).</w:t>
+      </w:r>
+    </w:p>
+    <w:p>
+      <w:pPr>
+        <w:keepNext/>
+        <w:tabs>
+          <w:tab w:val="right" w:pos="10620"/>
+        </w:tabs>
+        <w:spacing w:after="0" w:before="80" w:line="252"/>
+      </w:pPr>
+      <w:r>
+        <w:rPr>
+          <w:rFonts w:ascii="Calibri" w:cs="Calibri" w:eastAsia="Calibri" w:hAnsi="Calibri"/>
+          <w:b/>
+          <w:bCs/>
+          <w:sz w:val="20"/>
+          <w:szCs w:val="20"/>
+        </w:rPr>
+        <w:t xml:space="preserve">Euro Audit Conseil – cabinet d’audit et de conseil</w:t>
+      </w:r>
+      <w:r>
+        <w:rPr>
+          <w:rFonts w:ascii="Calibri" w:cs="Calibri" w:eastAsia="Calibri" w:hAnsi="Calibri"/>
+          <w:color w:val="555555"/>
+          <w:sz w:val="20"/>
+          <w:szCs w:val="20"/>
+        </w:rPr>
+        <w:t xml:space="preserve">, Toulouse</w:t>
+      </w:r>
+      <w:r>
+        <w:t xml:space="preserve">	</w:t>
+      </w:r>
+      <w:r>
+        <w:rPr>
+          <w:rFonts w:ascii="Calibri" w:cs="Calibri" w:eastAsia="Calibri" w:hAnsi="Calibri"/>
+          <w:b/>
+          <w:bCs/>
+          <w:color w:val="1F3864"/>
+          <w:sz w:val="20"/>
+          <w:szCs w:val="20"/>
+        </w:rPr>
+        <w:t xml:space="preserve">avr. 2023 – juin 2023</w:t>
+      </w:r>
+    </w:p>
+    <w:p>
+      <w:pPr>
+        <w:keepNext/>
+        <w:spacing w:after="30" w:before="0" w:line="252"/>
+      </w:pPr>
+      <w:r>
+        <w:rPr>
+          <w:rFonts w:ascii="Calibri" w:cs="Calibri" w:eastAsia="Calibri" w:hAnsi="Calibri"/>
+          <w:i/>
+          <w:iCs/>
+          <w:sz w:val="20"/>
+          <w:szCs w:val="20"/>
+        </w:rPr>
+        <w:t xml:space="preserve">Stagiaire audit et conseil financier</w:t>
       </w:r>
     </w:p>
     <w:p>
@@ -643,34 +790,54 @@
           <w:ilvl w:val="0"/>
           <w:numId w:val="2"/>
         </w:numPr>
-        <w:spacing w:after="10" w:before="0" w:line="240"/>
-      </w:pPr>
-      <w:r>
-        <w:rPr>
-          <w:rFonts w:ascii="Calibri" w:cs="Calibri" w:eastAsia="Calibri" w:hAnsi="Calibri"/>
-          <w:sz w:val="20"/>
-          <w:szCs w:val="20"/>
-        </w:rPr>
-        <w:t xml:space="preserve">Traité les opérations sur titres (remboursements anticipés, fusions, consentements) et contrôlé leur paramétrage.</w:t>
+        <w:spacing w:after="20" w:before="0" w:line="252"/>
+      </w:pPr>
+      <w:r>
+        <w:rPr>
+          <w:rFonts w:ascii="Calibri" w:cs="Calibri" w:eastAsia="Calibri" w:hAnsi="Calibri"/>
+          <w:sz w:val="20"/>
+          <w:szCs w:val="20"/>
+        </w:rPr>
+        <w:t xml:space="preserve">Analysé des plans financiers et des portefeuilles d’investissement de clients, évalué les risques (profil, allocation, concentration) ; rédigé rapports et présentations pour les réunions clients.</w:t>
+      </w:r>
+    </w:p>
+    <w:p>
+      <w:pPr>
+        <w:keepNext/>
+        <w:pBdr>
+          <w:bottom w:val="single" w:color="1F3864" w:sz="6" w:space="2"/>
+        </w:pBdr>
+        <w:spacing w:after="50" w:before="110"/>
+      </w:pPr>
+      <w:r>
+        <w:rPr>
+          <w:rFonts w:ascii="Calibri" w:cs="Calibri" w:eastAsia="Calibri" w:hAnsi="Calibri"/>
+          <w:b/>
+          <w:bCs/>
+          <w:color w:val="1F3864"/>
+          <w:sz w:val="22"/>
+          <w:szCs w:val="22"/>
+        </w:rPr>
+        <w:t xml:space="preserve">PROJET PERSONNEL – DONNÉES ON-CHAIN</w:t>
       </w:r>
     </w:p>
     <w:p>
       <w:pPr>
         <w:keepNext/>
         <w:tabs>
-          <w:tab w:val="right" w:pos="10580"/>
+          <w:tab w:val="right" w:pos="10620"/>
         </w:tabs>
-        <w:spacing w:after="0" w:before="70" w:line="240"/>
-      </w:pPr>
-      <w:r>
-        <w:rPr>
-          <w:rFonts w:ascii="Calibri" w:cs="Calibri" w:eastAsia="Calibri" w:hAnsi="Calibri"/>
-          <w:b/>
-          <w:bCs/>
-          <w:sz w:val="20"/>
-          <w:szCs w:val="20"/>
-        </w:rPr>
-        <w:t xml:space="preserve">Pôle Sud – cabinet d’expertise comptable</w:t>
+        <w:spacing w:after="0" w:before="80" w:line="252"/>
+      </w:pPr>
+      <w:r>
+        <w:rPr>
+          <w:rFonts w:ascii="Calibri" w:cs="Calibri" w:eastAsia="Calibri" w:hAnsi="Calibri"/>
+          <w:b/>
+          <w:bCs/>
+          <w:sz w:val="20"/>
+          <w:szCs w:val="20"/>
+        </w:rPr>
+        <w:t xml:space="preserve">Recherche quantitative sur un marché de prédiction décentralisé (Polymarket, blockchain Polygon)</w:t>
       </w:r>
       <w:r>
         <w:rPr>
@@ -679,7 +846,7 @@
           <w:sz w:val="20"/>
           <w:szCs w:val="20"/>
         </w:rPr>
-        <w:t xml:space="preserve">, Toulouse</w:t>
+        <w:t xml:space="preserve"/>
       </w:r>
       <w:r>
         <w:t xml:space="preserve">	</w:t>
@@ -693,23 +860,7 @@
           <w:sz w:val="20"/>
           <w:szCs w:val="20"/>
         </w:rPr>
-        <w:t xml:space="preserve">janv. – juin 2024</w:t>
-      </w:r>
-    </w:p>
-    <w:p>
-      <w:pPr>
-        <w:keepNext/>
-        <w:spacing w:after="10" w:before="0" w:line="240"/>
-      </w:pPr>
-      <w:r>
-        <w:rPr>
-          <w:rFonts w:ascii="Calibri" w:cs="Calibri" w:eastAsia="Calibri" w:hAnsi="Calibri"/>
-          <w:i/>
-          <w:iCs/>
-          <w:sz w:val="20"/>
-          <w:szCs w:val="20"/>
-        </w:rPr>
-        <w:t xml:space="preserve">Stagiaire comptable</w:t>
+        <w:t xml:space="preserve">2026</w:t>
       </w:r>
     </w:p>
     <w:p>
@@ -719,15 +870,15 @@
           <w:ilvl w:val="0"/>
           <w:numId w:val="2"/>
         </w:numPr>
-        <w:spacing w:after="10" w:before="0" w:line="240"/>
-      </w:pPr>
-      <w:r>
-        <w:rPr>
-          <w:rFonts w:ascii="Calibri" w:cs="Calibri" w:eastAsia="Calibri" w:hAnsi="Calibri"/>
-          <w:sz w:val="20"/>
-          <w:szCs w:val="20"/>
-        </w:rPr>
-        <w:t xml:space="preserve">Participé à l’établissement des états financiers (bilan, compte de résultat, tableau de flux de trésorerie) de PME.</w:t>
+        <w:spacing w:after="20" w:before="0" w:line="252"/>
+      </w:pPr>
+      <w:r>
+        <w:rPr>
+          <w:rFonts w:ascii="Calibri" w:cs="Calibri" w:eastAsia="Calibri" w:hAnsi="Calibri"/>
+          <w:sz w:val="20"/>
+          <w:szCs w:val="20"/>
+        </w:rPr>
+        <w:t xml:space="preserve">Collecté et analysé par API les carnets d’ordres de 12 000 événements et 3 500 instruments, suivi en temps réel sur 24 h ; chaque résultat documenté avec sa provenance (mesuré, calculé, hypothèse).</w:t>
       </w:r>
     </w:p>
     <w:p>
@@ -737,91 +888,15 @@
           <w:ilvl w:val="0"/>
           <w:numId w:val="2"/>
         </w:numPr>
-        <w:spacing w:after="10" w:before="0" w:line="240"/>
-      </w:pPr>
-      <w:r>
-        <w:rPr>
-          <w:rFonts w:ascii="Calibri" w:cs="Calibri" w:eastAsia="Calibri" w:hAnsi="Calibri"/>
-          <w:sz w:val="20"/>
-          <w:szCs w:val="20"/>
-        </w:rPr>
-        <w:t xml:space="preserve">Assisté les travaux d’audit (documentation, vérification des écritures et pièces justificatives) et participé aux clôtures mensuelles et annuelles.</w:t>
-      </w:r>
-    </w:p>
-    <w:p>
-      <w:pPr>
-        <w:keepNext/>
-        <w:tabs>
-          <w:tab w:val="right" w:pos="10580"/>
-        </w:tabs>
-        <w:spacing w:after="0" w:before="70" w:line="240"/>
-      </w:pPr>
-      <w:r>
-        <w:rPr>
-          <w:rFonts w:ascii="Calibri" w:cs="Calibri" w:eastAsia="Calibri" w:hAnsi="Calibri"/>
-          <w:b/>
-          <w:bCs/>
-          <w:sz w:val="20"/>
-          <w:szCs w:val="20"/>
-        </w:rPr>
-        <w:t xml:space="preserve">Euro Audit Conseil – cabinet d’audit</w:t>
-      </w:r>
-      <w:r>
-        <w:rPr>
-          <w:rFonts w:ascii="Calibri" w:cs="Calibri" w:eastAsia="Calibri" w:hAnsi="Calibri"/>
-          <w:color w:val="555555"/>
-          <w:sz w:val="20"/>
-          <w:szCs w:val="20"/>
-        </w:rPr>
-        <w:t xml:space="preserve">, Toulouse</w:t>
-      </w:r>
-      <w:r>
-        <w:t xml:space="preserve">	</w:t>
-      </w:r>
-      <w:r>
-        <w:rPr>
-          <w:rFonts w:ascii="Calibri" w:cs="Calibri" w:eastAsia="Calibri" w:hAnsi="Calibri"/>
-          <w:b/>
-          <w:bCs/>
-          <w:color w:val="1F3864"/>
-          <w:sz w:val="20"/>
-          <w:szCs w:val="20"/>
-        </w:rPr>
-        <w:t xml:space="preserve">avr. – juin 2023</w:t>
-      </w:r>
-    </w:p>
-    <w:p>
-      <w:pPr>
-        <w:keepNext/>
-        <w:spacing w:after="10" w:before="0" w:line="240"/>
-      </w:pPr>
-      <w:r>
-        <w:rPr>
-          <w:rFonts w:ascii="Calibri" w:cs="Calibri" w:eastAsia="Calibri" w:hAnsi="Calibri"/>
-          <w:i/>
-          <w:iCs/>
-          <w:sz w:val="20"/>
-          <w:szCs w:val="20"/>
-        </w:rPr>
-        <w:t xml:space="preserve">Stagiaire audit et analyse financière</w:t>
-      </w:r>
-    </w:p>
-    <w:p>
-      <w:pPr>
-        <w:pStyle w:val="ListParagraph"/>
-        <w:numPr>
-          <w:ilvl w:val="0"/>
-          <w:numId w:val="2"/>
-        </w:numPr>
-        <w:spacing w:after="10" w:before="0" w:line="240"/>
-      </w:pPr>
-      <w:r>
-        <w:rPr>
-          <w:rFonts w:ascii="Calibri" w:cs="Calibri" w:eastAsia="Calibri" w:hAnsi="Calibri"/>
-          <w:sz w:val="20"/>
-          <w:szCs w:val="20"/>
-        </w:rPr>
-        <w:t xml:space="preserve">Contribué à l’analyse financière de dossiers clients et à l’évaluation des risques ; rédigé des rapports et supports de synthèse pour les réunions clients.</w:t>
+        <w:spacing w:after="20" w:before="0" w:line="252"/>
+      </w:pPr>
+      <w:r>
+        <w:rPr>
+          <w:rFonts w:ascii="Calibri" w:cs="Calibri" w:eastAsia="Calibri" w:hAnsi="Calibri"/>
+          <w:sz w:val="20"/>
+          <w:szCs w:val="20"/>
+        </w:rPr>
+        <w:t xml:space="preserve">Audité en lecture seule 20 dépôts open source avant toute utilisation : exfiltration de clés, code obfusqué, dépendances à risque ; verdict de sécurité par dépôt.</w:t>
       </w:r>
     </w:p>
     <w:p>
@@ -830,7 +905,7 @@
         <w:pBdr>
           <w:bottom w:val="single" w:color="1F3864" w:sz="6" w:space="2"/>
         </w:pBdr>
-        <w:spacing w:after="30" w:before="90"/>
+        <w:spacing w:after="50" w:before="110"/>
       </w:pPr>
       <w:r>
         <w:rPr>
@@ -841,12 +916,12 @@
           <w:sz w:val="22"/>
           <w:szCs w:val="22"/>
         </w:rPr>
-        <w:t xml:space="preserve">COMPÉTENCES</w:t>
-      </w:r>
-    </w:p>
-    <w:p>
-      <w:pPr>
-        <w:spacing w:after="20" w:before="0" w:line="240"/>
+        <w:t xml:space="preserve">COMPÉTENCES ET DIVERS</w:t>
+      </w:r>
+    </w:p>
+    <w:p>
+      <w:pPr>
+        <w:spacing w:after="40" w:before="0" w:line="252"/>
       </w:pPr>
       <w:r>
         <w:rPr>
@@ -864,12 +939,12 @@
           <w:sz w:val="20"/>
           <w:szCs w:val="20"/>
         </w:rPr>
-        <w:t xml:space="preserve">comptabilité française (DCG), IFRS, audit et contrôle interne ; instruments financiers (obligations, EMTN, dérivés, fonds) ; actifs numériques : registres distribués et veille réglementaire (MiCA, lutte contre le blanchiment).</w:t>
-      </w:r>
-    </w:p>
-    <w:p>
-      <w:pPr>
-        <w:spacing w:after="20" w:before="0" w:line="240"/>
+        <w:t xml:space="preserve">comptabilité française (DCG), IFRS, audit et contrôle interne ; instruments financiers ; actifs numériques (registres distribués, traçabilité, cadre MiCA, lutte contre le blanchiment).</w:t>
+      </w:r>
+    </w:p>
+    <w:p>
+      <w:pPr>
+        <w:spacing w:after="40" w:before="0" w:line="252"/>
       </w:pPr>
       <w:r>
         <w:rPr>
@@ -887,12 +962,12 @@
           <w:sz w:val="20"/>
           <w:szCs w:val="20"/>
         </w:rPr>
-        <w:t xml:space="preserve">Excel avancé (TCD, Power Query, VBA), Power Automate, SQL, Python (notions), SimCorp Dimension, Bloomberg.</w:t>
-      </w:r>
-    </w:p>
-    <w:p>
-      <w:pPr>
-        <w:spacing w:after="20" w:before="0" w:line="240"/>
+        <w:t xml:space="preserve">Excel avancé (TCD, Power Query, VBA), Power Automate, SQL, Python, SimCorp Dimension, Bloomberg, API de marché.</w:t>
+      </w:r>
+    </w:p>
+    <w:p>
+      <w:pPr>
+        <w:spacing w:after="40" w:before="0" w:line="252"/>
       </w:pPr>
       <w:r>
         <w:rPr>
@@ -910,78 +985,69 @@
           <w:sz w:val="20"/>
           <w:szCs w:val="20"/>
         </w:rPr>
-        <w:t xml:space="preserve">Français – langue maternelle ; Anglais – courant, C1 (TOEIC 985/990) ; Arabe – intermédiaire.</w:t>
-      </w:r>
-    </w:p>
-    <w:p>
-      <w:pPr>
-        <w:keepNext/>
-        <w:pBdr>
-          <w:bottom w:val="single" w:color="1F3864" w:sz="6" w:space="2"/>
-        </w:pBdr>
-        <w:spacing w:after="30" w:before="90"/>
-      </w:pPr>
-      <w:r>
-        <w:rPr>
-          <w:rFonts w:ascii="Calibri" w:cs="Calibri" w:eastAsia="Calibri" w:hAnsi="Calibri"/>
-          <w:b/>
-          <w:bCs/>
-          <w:color w:val="1F3864"/>
-          <w:sz w:val="22"/>
-          <w:szCs w:val="22"/>
-        </w:rPr>
-        <w:t xml:space="preserve">ENGAGEMENTS</w:t>
-      </w:r>
-    </w:p>
-    <w:p>
-      <w:pPr>
-        <w:spacing w:after="20" w:before="0" w:line="240"/>
-      </w:pPr>
-      <w:r>
-        <w:rPr>
-          <w:rFonts w:ascii="Calibri" w:cs="Calibri" w:eastAsia="Calibri" w:hAnsi="Calibri"/>
-          <w:b/>
-          <w:bCs/>
-          <w:sz w:val="20"/>
-          <w:szCs w:val="20"/>
-        </w:rPr>
-        <w:t xml:space="preserve">Ethereum France, association loi 1901 (éducation et formation) – membre actif depuis 2024 : </w:t>
-      </w:r>
-      <w:r>
-        <w:rPr>
-          <w:rFonts w:ascii="Calibri" w:cs="Calibri" w:eastAsia="Calibri" w:hAnsi="Calibri"/>
-          <w:sz w:val="20"/>
-          <w:szCs w:val="20"/>
-        </w:rPr>
-        <w:t xml:space="preserve">rédaction de contenus pédagogiques sur les actifs numériques (registres distribués, traçabilité des transactions, smart contracts) pour la communauté francophone ; participation aux meetups et événements.</w:t>
-      </w:r>
-    </w:p>
-    <w:p>
-      <w:pPr>
-        <w:spacing w:after="20" w:before="0" w:line="240"/>
-      </w:pPr>
-      <w:r>
-        <w:rPr>
-          <w:rFonts w:ascii="Calibri" w:cs="Calibri" w:eastAsia="Calibri" w:hAnsi="Calibri"/>
-          <w:b/>
-          <w:bCs/>
-          <w:sz w:val="20"/>
-          <w:szCs w:val="20"/>
-        </w:rPr>
-        <w:t xml:space="preserve">Projet « Quartier Propre », Toulouse – fondateur, 2022 – 2023 : </w:t>
-      </w:r>
-      <w:r>
-        <w:rPr>
-          <w:rFonts w:ascii="Calibri" w:cs="Calibri" w:eastAsia="Calibri" w:hAnsi="Calibri"/>
-          <w:sz w:val="20"/>
-          <w:szCs w:val="20"/>
-        </w:rPr>
-        <w:t xml:space="preserve">opérations de nettoyage et ateliers de sensibilisation avec des associations locales.</w:t>
+        <w:t xml:space="preserve">Français – langue maternelle ; Anglais – courant, C1 (TOEIC 985/990) ; Arabe – intermédiaire (B1).</w:t>
+      </w:r>
+    </w:p>
+    <w:p>
+      <w:pPr>
+        <w:spacing w:after="40" w:before="0" w:line="252"/>
+      </w:pPr>
+      <w:r>
+        <w:rPr>
+          <w:rFonts w:ascii="Calibri" w:cs="Calibri" w:eastAsia="Calibri" w:hAnsi="Calibri"/>
+          <w:b/>
+          <w:bCs/>
+          <w:sz w:val="20"/>
+          <w:szCs w:val="20"/>
+        </w:rPr>
+        <w:t xml:space="preserve">Engagement : </w:t>
+      </w:r>
+      <w:r>
+        <w:rPr>
+          <w:rFonts w:ascii="Calibri" w:cs="Calibri" w:eastAsia="Calibri" w:hAnsi="Calibri"/>
+          <w:sz w:val="20"/>
+          <w:szCs w:val="20"/>
+        </w:rPr>
+        <w:t xml:space="preserve">fondateur du projet « Quartier Propre », Toulouse (sept. 2022 – févr. 2023), nettoyages et ateliers citoyens.</w:t>
+      </w:r>
+    </w:p>
+    <w:p>
+      <w:pPr>
+        <w:spacing w:after="40" w:before="0" w:line="252"/>
+      </w:pPr>
+      <w:r>
+        <w:rPr>
+          <w:rFonts w:ascii="Calibri" w:cs="Calibri" w:eastAsia="Calibri" w:hAnsi="Calibri"/>
+          <w:b/>
+          <w:bCs/>
+          <w:sz w:val="20"/>
+          <w:szCs w:val="20"/>
+        </w:rPr>
+        <w:t xml:space="preserve">Centres d’intérêt : </w:t>
+      </w:r>
+      <w:r>
+        <w:rPr>
+          <w:rFonts w:ascii="Calibri" w:cs="Calibri" w:eastAsia="Calibri" w:hAnsi="Calibri"/>
+          <w:sz w:val="20"/>
+          <w:szCs w:val="20"/>
+        </w:rPr>
+        <w:t xml:space="preserve">technologies financières et actifs numériques, sport.  </w:t>
+      </w:r>
+      <w:r>
+        <w:rPr>
+          <w:rFonts w:ascii="Calibri" w:cs="Calibri" w:eastAsia="Calibri" w:hAnsi="Calibri"/>
+          <w:i/>
+          <w:iCs/>
+          <w:color w:val="555555"/>
+          <w:sz w:val="20"/>
+          <w:szCs w:val="20"/>
+        </w:rPr>
+        <w:t xml:space="preserve">Références disponibles sur demande.</w:t>
       </w:r>
     </w:p>
     <w:sectPr>
       <w:pgSz w:w="11906" w:h="16838" w:orient="portrait"/>
-      <w:pgMar w:top="500" w:right="680" w:bottom="460" w:left="680" w:header="708" w:footer="708" w:gutter="0"/>
+      <w:pgMar w:top="460" w:right="660" w:bottom="420" w:left="660" w:header="708" w:footer="708" w:gutter="0"/>
       <w:pgNumType/>
       <w:docGrid w:linePitch="360"/>
     </w:sectPr>

</xml_diff>